<commit_message>
Week 06 Poject Updated
</commit_message>
<xml_diff>
--- a/project/styles/index-css.docx
+++ b/project/styles/index-css.docx
@@ -1655,14 +1655,12 @@
       <w:pPr>
         <w:rPr>
           <w:strike/>
-          <w:lang w:val="en-US"/>
         </w:rPr>
       </w:pPr>
       <w:proofErr w:type="gramStart"/>
       <w:r>
         <w:rPr>
           <w:strike/>
-          <w:lang w:val="en-US"/>
         </w:rPr>
         <w:t>.logo</w:t>
       </w:r>
@@ -1670,7 +1668,6 @@
       <w:r>
         <w:rPr>
           <w:strike/>
-          <w:lang w:val="en-US"/>
         </w:rPr>
         <w:t xml:space="preserve"> h1 {</w:t>
       </w:r>
@@ -1679,13 +1676,11 @@
       <w:pPr>
         <w:rPr>
           <w:strike/>
-          <w:lang w:val="en-US"/>
-        </w:rPr>
-      </w:pPr>
-      <w:r>
-        <w:rPr>
-          <w:strike/>
-          <w:lang w:val="en-US"/>
+        </w:rPr>
+      </w:pPr>
+      <w:r>
+        <w:rPr>
+          <w:strike/>
         </w:rPr>
         <w:t>  font-size: 1.8rem;</w:t>
       </w:r>
@@ -1700,9 +1695,15 @@
       <w:r>
         <w:rPr>
           <w:strike/>
-          <w:lang w:val="en-US"/>
-        </w:rPr>
-        <w:t>  font-weight: 600;</w:t>
+        </w:rPr>
+        <w:t xml:space="preserve">  </w:t>
+      </w:r>
+      <w:r>
+        <w:rPr>
+          <w:strike/>
+          <w:lang w:val="en-US"/>
+        </w:rPr>
+        <w:t>font-weight: 600;</w:t>
       </w:r>
     </w:p>
     <w:p>
@@ -1754,11 +1755,13 @@
     <w:p>
       <w:pPr>
         <w:rPr>
-          <w:lang w:val="en-US"/>
-        </w:rPr>
-      </w:pPr>
-      <w:r>
-        <w:rPr>
+          <w:strike/>
+          <w:lang w:val="en-US"/>
+        </w:rPr>
+      </w:pPr>
+      <w:r>
+        <w:rPr>
+          <w:strike/>
           <w:lang w:val="en-US"/>
         </w:rPr>
         <w:lastRenderedPageBreak/>
@@ -1768,11 +1771,13 @@
     <w:p>
       <w:pPr>
         <w:rPr>
-          <w:lang w:val="en-US"/>
-        </w:rPr>
-      </w:pPr>
-      <w:r>
-        <w:rPr>
+          <w:strike/>
+          <w:lang w:val="en-US"/>
+        </w:rPr>
+      </w:pPr>
+      <w:r>
+        <w:rPr>
+          <w:strike/>
           <w:lang w:val="en-US"/>
         </w:rPr>
         <w:t>  display: flex;</w:t>
@@ -1781,11 +1786,13 @@
     <w:p>
       <w:pPr>
         <w:rPr>
-          <w:lang w:val="en-US"/>
-        </w:rPr>
-      </w:pPr>
-      <w:r>
-        <w:rPr>
+          <w:strike/>
+          <w:lang w:val="en-US"/>
+        </w:rPr>
+      </w:pPr>
+      <w:r>
+        <w:rPr>
+          <w:strike/>
           <w:lang w:val="en-US"/>
         </w:rPr>
         <w:t>  list-style: none;</w:t>
@@ -1794,11 +1801,13 @@
     <w:p>
       <w:pPr>
         <w:rPr>
-          <w:lang w:val="en-US"/>
-        </w:rPr>
-      </w:pPr>
-      <w:r>
-        <w:rPr>
+          <w:strike/>
+          <w:lang w:val="en-US"/>
+        </w:rPr>
+      </w:pPr>
+      <w:r>
+        <w:rPr>
+          <w:strike/>
           <w:lang w:val="en-US"/>
         </w:rPr>
         <w:t>}</w:t>
@@ -2230,18 +2239,21 @@
     <w:p>
       <w:pPr>
         <w:rPr>
-          <w:lang w:val="en-US"/>
-        </w:rPr>
-      </w:pPr>
-    </w:p>
-    <w:p>
-      <w:pPr>
-        <w:rPr>
-          <w:lang w:val="en-US"/>
-        </w:rPr>
-      </w:pPr>
-      <w:r>
-        <w:rPr>
+          <w:strike/>
+          <w:lang w:val="en-US"/>
+        </w:rPr>
+      </w:pPr>
+    </w:p>
+    <w:p>
+      <w:pPr>
+        <w:rPr>
+          <w:strike/>
+          <w:lang w:val="en-US"/>
+        </w:rPr>
+      </w:pPr>
+      <w:r>
+        <w:rPr>
+          <w:strike/>
           <w:lang w:val="en-US"/>
         </w:rPr>
         <w:t>/* Hidden hamburger buttonin desktop */</w:t>
@@ -2250,24 +2262,46 @@
     <w:p>
       <w:pPr>
         <w:rPr>
-          <w:lang w:val="en-US"/>
-        </w:rPr>
-      </w:pPr>
-      <w:r>
-        <w:rPr>
-          <w:lang w:val="en-US"/>
-        </w:rPr>
-        <w:t>.menu-toggle{</w:t>
-      </w:r>
-    </w:p>
-    <w:p>
-      <w:pPr>
-        <w:rPr>
-          <w:lang w:val="en-US"/>
-        </w:rPr>
-      </w:pPr>
-      <w:r>
-        <w:rPr>
+          <w:strike/>
+          <w:lang w:val="en-US"/>
+        </w:rPr>
+      </w:pPr>
+      <w:proofErr w:type="gramStart"/>
+      <w:r>
+        <w:rPr>
+          <w:strike/>
+          <w:lang w:val="en-US"/>
+        </w:rPr>
+        <w:t>.menu</w:t>
+      </w:r>
+      <w:proofErr w:type="gramEnd"/>
+      <w:r>
+        <w:rPr>
+          <w:strike/>
+          <w:lang w:val="en-US"/>
+        </w:rPr>
+        <w:t>-</w:t>
+      </w:r>
+      <w:proofErr w:type="gramStart"/>
+      <w:r>
+        <w:rPr>
+          <w:strike/>
+          <w:lang w:val="en-US"/>
+        </w:rPr>
+        <w:t>toggle{</w:t>
+      </w:r>
+      <w:proofErr w:type="gramEnd"/>
+    </w:p>
+    <w:p>
+      <w:pPr>
+        <w:rPr>
+          <w:strike/>
+          <w:lang w:val="en-US"/>
+        </w:rPr>
+      </w:pPr>
+      <w:r>
+        <w:rPr>
+          <w:strike/>
           <w:lang w:val="en-US"/>
         </w:rPr>
         <w:t>  display: none;</w:t>
@@ -2276,11 +2310,13 @@
     <w:p>
       <w:pPr>
         <w:rPr>
-          <w:lang w:val="en-US"/>
-        </w:rPr>
-      </w:pPr>
-      <w:r>
-        <w:rPr>
+          <w:strike/>
+          <w:lang w:val="en-US"/>
+        </w:rPr>
+      </w:pPr>
+      <w:r>
+        <w:rPr>
+          <w:strike/>
           <w:lang w:val="en-US"/>
         </w:rPr>
         <w:t>  background: transparent;</w:t>
@@ -2289,37 +2325,75 @@
     <w:p>
       <w:pPr>
         <w:rPr>
-          <w:lang w:val="en-US"/>
-        </w:rPr>
-      </w:pPr>
-      <w:r>
-        <w:rPr>
-          <w:lang w:val="en-US"/>
-        </w:rPr>
-        <w:t>  border: 1px solid var(--text-color);</w:t>
-      </w:r>
-    </w:p>
-    <w:p>
-      <w:pPr>
-        <w:rPr>
-          <w:lang w:val="en-US"/>
-        </w:rPr>
-      </w:pPr>
-      <w:r>
-        <w:rPr>
-          <w:lang w:val="en-US"/>
-        </w:rPr>
-        <w:t>  color: var(--text-color);</w:t>
-      </w:r>
-    </w:p>
-    <w:p>
-      <w:pPr>
-        <w:rPr>
-          <w:lang w:val="en-US"/>
-        </w:rPr>
-      </w:pPr>
-      <w:r>
-        <w:rPr>
+          <w:strike/>
+          <w:lang w:val="en-US"/>
+        </w:rPr>
+      </w:pPr>
+      <w:r>
+        <w:rPr>
+          <w:strike/>
+          <w:lang w:val="en-US"/>
+        </w:rPr>
+        <w:t xml:space="preserve">  border: 1px solid </w:t>
+      </w:r>
+      <w:proofErr w:type="gramStart"/>
+      <w:r>
+        <w:rPr>
+          <w:strike/>
+          <w:lang w:val="en-US"/>
+        </w:rPr>
+        <w:t>var(</w:t>
+      </w:r>
+      <w:proofErr w:type="gramEnd"/>
+      <w:r>
+        <w:rPr>
+          <w:strike/>
+          <w:lang w:val="en-US"/>
+        </w:rPr>
+        <w:t>--text-color);</w:t>
+      </w:r>
+    </w:p>
+    <w:p>
+      <w:pPr>
+        <w:rPr>
+          <w:strike/>
+          <w:lang w:val="en-US"/>
+        </w:rPr>
+      </w:pPr>
+      <w:r>
+        <w:rPr>
+          <w:strike/>
+          <w:lang w:val="en-US"/>
+        </w:rPr>
+        <w:t xml:space="preserve">  color: </w:t>
+      </w:r>
+      <w:proofErr w:type="gramStart"/>
+      <w:r>
+        <w:rPr>
+          <w:strike/>
+          <w:lang w:val="en-US"/>
+        </w:rPr>
+        <w:t>var(</w:t>
+      </w:r>
+      <w:proofErr w:type="gramEnd"/>
+      <w:r>
+        <w:rPr>
+          <w:strike/>
+          <w:lang w:val="en-US"/>
+        </w:rPr>
+        <w:t>--text-color);</w:t>
+      </w:r>
+    </w:p>
+    <w:p>
+      <w:pPr>
+        <w:rPr>
+          <w:strike/>
+          <w:lang w:val="en-US"/>
+        </w:rPr>
+      </w:pPr>
+      <w:r>
+        <w:rPr>
+          <w:strike/>
           <w:lang w:val="en-US"/>
         </w:rPr>
         <w:t>  width: 44px;</w:t>
@@ -2328,11 +2402,13 @@
     <w:p>
       <w:pPr>
         <w:rPr>
-          <w:lang w:val="en-US"/>
-        </w:rPr>
-      </w:pPr>
-      <w:r>
-        <w:rPr>
+          <w:strike/>
+          <w:lang w:val="en-US"/>
+        </w:rPr>
+      </w:pPr>
+      <w:r>
+        <w:rPr>
+          <w:strike/>
           <w:lang w:val="en-US"/>
         </w:rPr>
         <w:t>  height: 44px;</w:t>
@@ -2341,11 +2417,13 @@
     <w:p>
       <w:pPr>
         <w:rPr>
-          <w:lang w:val="en-US"/>
-        </w:rPr>
-      </w:pPr>
-      <w:r>
-        <w:rPr>
+          <w:strike/>
+          <w:lang w:val="en-US"/>
+        </w:rPr>
+      </w:pPr>
+      <w:r>
+        <w:rPr>
+          <w:strike/>
           <w:lang w:val="en-US"/>
         </w:rPr>
         <w:t>  padding: 10px;</w:t>
@@ -2354,11 +2432,13 @@
     <w:p>
       <w:pPr>
         <w:rPr>
-          <w:lang w:val="en-US"/>
-        </w:rPr>
-      </w:pPr>
-      <w:r>
-        <w:rPr>
+          <w:strike/>
+          <w:lang w:val="en-US"/>
+        </w:rPr>
+      </w:pPr>
+      <w:r>
+        <w:rPr>
+          <w:strike/>
           <w:lang w:val="en-US"/>
         </w:rPr>
         <w:t>  border-radius: 8px;</w:t>
@@ -2367,11 +2447,13 @@
     <w:p>
       <w:pPr>
         <w:rPr>
-          <w:lang w:val="en-US"/>
-        </w:rPr>
-      </w:pPr>
-      <w:r>
-        <w:rPr>
+          <w:strike/>
+          <w:lang w:val="en-US"/>
+        </w:rPr>
+      </w:pPr>
+      <w:r>
+        <w:rPr>
+          <w:strike/>
           <w:lang w:val="en-US"/>
         </w:rPr>
         <w:t>  cursor: pointer;</w:t>
@@ -2380,11 +2462,13 @@
     <w:p>
       <w:pPr>
         <w:rPr>
-          <w:lang w:val="en-US"/>
-        </w:rPr>
-      </w:pPr>
-      <w:r>
-        <w:rPr>
+          <w:strike/>
+          <w:lang w:val="en-US"/>
+        </w:rPr>
+      </w:pPr>
+      <w:r>
+        <w:rPr>
+          <w:strike/>
           <w:lang w:val="en-US"/>
         </w:rPr>
         <w:t>  flex-direction: column;</w:t>
@@ -2393,11 +2477,13 @@
     <w:p>
       <w:pPr>
         <w:rPr>
-          <w:lang w:val="en-US"/>
-        </w:rPr>
-      </w:pPr>
-      <w:r>
-        <w:rPr>
+          <w:strike/>
+          <w:lang w:val="en-US"/>
+        </w:rPr>
+      </w:pPr>
+      <w:r>
+        <w:rPr>
+          <w:strike/>
           <w:lang w:val="en-US"/>
         </w:rPr>
         <w:t>  gap: 6px;</w:t>
@@ -2406,11 +2492,13 @@
     <w:p>
       <w:pPr>
         <w:rPr>
-          <w:lang w:val="en-US"/>
-        </w:rPr>
-      </w:pPr>
-      <w:r>
-        <w:rPr>
+          <w:strike/>
+          <w:lang w:val="en-US"/>
+        </w:rPr>
+      </w:pPr>
+      <w:r>
+        <w:rPr>
+          <w:strike/>
           <w:lang w:val="en-US"/>
         </w:rPr>
         <w:t>}</w:t>
@@ -2419,18 +2507,21 @@
     <w:p>
       <w:pPr>
         <w:rPr>
-          <w:lang w:val="en-US"/>
-        </w:rPr>
-      </w:pPr>
-    </w:p>
-    <w:p>
-      <w:pPr>
-        <w:rPr>
-          <w:lang w:val="en-US"/>
-        </w:rPr>
-      </w:pPr>
-      <w:r>
-        <w:rPr>
+          <w:strike/>
+          <w:lang w:val="en-US"/>
+        </w:rPr>
+      </w:pPr>
+    </w:p>
+    <w:p>
+      <w:pPr>
+        <w:rPr>
+          <w:strike/>
+          <w:lang w:val="en-US"/>
+        </w:rPr>
+      </w:pPr>
+      <w:r>
+        <w:rPr>
+          <w:strike/>
           <w:lang w:val="en-US"/>
         </w:rPr>
         <w:t>/* Three lines */</w:t>
@@ -2439,24 +2530,46 @@
     <w:p>
       <w:pPr>
         <w:rPr>
-          <w:lang w:val="en-US"/>
-        </w:rPr>
-      </w:pPr>
-      <w:r>
-        <w:rPr>
-          <w:lang w:val="en-US"/>
-        </w:rPr>
-        <w:t>.menu-toggle span{</w:t>
-      </w:r>
-    </w:p>
-    <w:p>
-      <w:pPr>
-        <w:rPr>
-          <w:lang w:val="en-US"/>
-        </w:rPr>
-      </w:pPr>
-      <w:r>
-        <w:rPr>
+          <w:strike/>
+          <w:lang w:val="en-US"/>
+        </w:rPr>
+      </w:pPr>
+      <w:proofErr w:type="gramStart"/>
+      <w:r>
+        <w:rPr>
+          <w:strike/>
+          <w:lang w:val="en-US"/>
+        </w:rPr>
+        <w:t>.menu</w:t>
+      </w:r>
+      <w:proofErr w:type="gramEnd"/>
+      <w:r>
+        <w:rPr>
+          <w:strike/>
+          <w:lang w:val="en-US"/>
+        </w:rPr>
+        <w:t xml:space="preserve">-toggle </w:t>
+      </w:r>
+      <w:proofErr w:type="gramStart"/>
+      <w:r>
+        <w:rPr>
+          <w:strike/>
+          <w:lang w:val="en-US"/>
+        </w:rPr>
+        <w:t>span{</w:t>
+      </w:r>
+      <w:proofErr w:type="gramEnd"/>
+    </w:p>
+    <w:p>
+      <w:pPr>
+        <w:rPr>
+          <w:strike/>
+          <w:lang w:val="en-US"/>
+        </w:rPr>
+      </w:pPr>
+      <w:r>
+        <w:rPr>
+          <w:strike/>
           <w:lang w:val="en-US"/>
         </w:rPr>
         <w:t>  display: block;</w:t>
@@ -2465,11 +2578,13 @@
     <w:p>
       <w:pPr>
         <w:rPr>
-          <w:lang w:val="en-US"/>
-        </w:rPr>
-      </w:pPr>
-      <w:r>
-        <w:rPr>
+          <w:strike/>
+          <w:lang w:val="en-US"/>
+        </w:rPr>
+      </w:pPr>
+      <w:r>
+        <w:rPr>
+          <w:strike/>
           <w:lang w:val="en-US"/>
         </w:rPr>
         <w:t>  height: 2px;</w:t>
@@ -2478,11 +2593,13 @@
     <w:p>
       <w:pPr>
         <w:rPr>
-          <w:lang w:val="en-US"/>
-        </w:rPr>
-      </w:pPr>
-      <w:r>
-        <w:rPr>
+          <w:strike/>
+          <w:lang w:val="en-US"/>
+        </w:rPr>
+      </w:pPr>
+      <w:r>
+        <w:rPr>
+          <w:strike/>
           <w:lang w:val="en-US"/>
         </w:rPr>
         <w:t>  width: 100%;</w:t>
@@ -2491,11 +2608,13 @@
     <w:p>
       <w:pPr>
         <w:rPr>
-          <w:lang w:val="en-US"/>
-        </w:rPr>
-      </w:pPr>
-      <w:r>
-        <w:rPr>
+          <w:strike/>
+          <w:lang w:val="en-US"/>
+        </w:rPr>
+      </w:pPr>
+      <w:r>
+        <w:rPr>
+          <w:strike/>
           <w:lang w:val="en-US"/>
         </w:rPr>
         <w:t>  margin: 0;</w:t>
@@ -2504,11 +2623,13 @@
     <w:p>
       <w:pPr>
         <w:rPr>
-          <w:lang w:val="en-US"/>
-        </w:rPr>
-      </w:pPr>
-      <w:r>
-        <w:rPr>
+          <w:strike/>
+          <w:lang w:val="en-US"/>
+        </w:rPr>
+      </w:pPr>
+      <w:r>
+        <w:rPr>
+          <w:strike/>
           <w:lang w:val="en-US"/>
         </w:rPr>
         <w:t>  background: currentColor;</w:t>
@@ -2517,11 +2638,13 @@
     <w:p>
       <w:pPr>
         <w:rPr>
-          <w:lang w:val="en-US"/>
-        </w:rPr>
-      </w:pPr>
-      <w:r>
-        <w:rPr>
+          <w:strike/>
+          <w:lang w:val="en-US"/>
+        </w:rPr>
+      </w:pPr>
+      <w:r>
+        <w:rPr>
+          <w:strike/>
           <w:lang w:val="en-US"/>
         </w:rPr>
         <w:t>  transition: transform 0.2s ease, opacity 0.2s ease;</w:t>
@@ -2530,11 +2653,13 @@
     <w:p>
       <w:pPr>
         <w:rPr>
-          <w:lang w:val="en-US"/>
-        </w:rPr>
-      </w:pPr>
-      <w:r>
-        <w:rPr>
+          <w:strike/>
+          <w:lang w:val="en-US"/>
+        </w:rPr>
+      </w:pPr>
+      <w:r>
+        <w:rPr>
+          <w:strike/>
           <w:lang w:val="en-US"/>
         </w:rPr>
         <w:t>}</w:t>
@@ -2543,18 +2668,21 @@
     <w:p>
       <w:pPr>
         <w:rPr>
-          <w:lang w:val="en-US"/>
-        </w:rPr>
-      </w:pPr>
-    </w:p>
-    <w:p>
-      <w:pPr>
-        <w:rPr>
-          <w:lang w:val="en-US"/>
-        </w:rPr>
-      </w:pPr>
-      <w:r>
-        <w:rPr>
+          <w:strike/>
+          <w:lang w:val="en-US"/>
+        </w:rPr>
+      </w:pPr>
+    </w:p>
+    <w:p>
+      <w:pPr>
+        <w:rPr>
+          <w:strike/>
+          <w:lang w:val="en-US"/>
+        </w:rPr>
+      </w:pPr>
+      <w:r>
+        <w:rPr>
+          <w:strike/>
           <w:lang w:val="en-US"/>
         </w:rPr>
         <w:t>/* Mobile */</w:t>
@@ -2563,32 +2691,46 @@
     <w:p>
       <w:pPr>
         <w:rPr>
-          <w:lang w:val="en-US"/>
-        </w:rPr>
-      </w:pPr>
-      <w:r>
-        <w:rPr>
+          <w:strike/>
+          <w:lang w:val="en-US"/>
+        </w:rPr>
+      </w:pPr>
+      <w:r>
+        <w:rPr>
+          <w:strike/>
           <w:lang w:val="en-US"/>
         </w:rPr>
         <w:lastRenderedPageBreak/>
-        <w:t>@media (max-width: 767px){</w:t>
-      </w:r>
-    </w:p>
-    <w:p>
-      <w:pPr>
-        <w:rPr>
-          <w:lang w:val="en-US"/>
-        </w:rPr>
-      </w:pPr>
-    </w:p>
-    <w:p>
-      <w:pPr>
-        <w:rPr>
-          <w:lang w:val="en-US"/>
-        </w:rPr>
-      </w:pPr>
-      <w:r>
-        <w:rPr>
+        <w:t>@media (max-width: 767</w:t>
+      </w:r>
+      <w:proofErr w:type="gramStart"/>
+      <w:r>
+        <w:rPr>
+          <w:strike/>
+          <w:lang w:val="en-US"/>
+        </w:rPr>
+        <w:t>px){</w:t>
+      </w:r>
+      <w:proofErr w:type="gramEnd"/>
+    </w:p>
+    <w:p>
+      <w:pPr>
+        <w:rPr>
+          <w:strike/>
+          <w:lang w:val="en-US"/>
+        </w:rPr>
+      </w:pPr>
+    </w:p>
+    <w:p>
+      <w:pPr>
+        <w:rPr>
+          <w:strike/>
+          <w:lang w:val="en-US"/>
+        </w:rPr>
+      </w:pPr>
+      <w:r>
+        <w:rPr>
+          <w:strike/>
           <w:lang w:val="en-US"/>
         </w:rPr>
         <w:t>  /* Shows hamburger button */</w:t>
@@ -2597,24 +2739,53 @@
     <w:p>
       <w:pPr>
         <w:rPr>
-          <w:lang w:val="en-US"/>
-        </w:rPr>
-      </w:pPr>
-      <w:r>
-        <w:rPr>
-          <w:lang w:val="en-US"/>
-        </w:rPr>
-        <w:t>  .menu-toggle{</w:t>
-      </w:r>
-    </w:p>
-    <w:p>
-      <w:pPr>
-        <w:rPr>
-          <w:lang w:val="en-US"/>
-        </w:rPr>
-      </w:pPr>
-      <w:r>
-        <w:rPr>
+          <w:strike/>
+          <w:lang w:val="en-US"/>
+        </w:rPr>
+      </w:pPr>
+      <w:r>
+        <w:rPr>
+          <w:strike/>
+          <w:lang w:val="en-US"/>
+        </w:rPr>
+        <w:t xml:space="preserve">  </w:t>
+      </w:r>
+      <w:proofErr w:type="gramStart"/>
+      <w:r>
+        <w:rPr>
+          <w:strike/>
+          <w:lang w:val="en-US"/>
+        </w:rPr>
+        <w:t>.menu</w:t>
+      </w:r>
+      <w:proofErr w:type="gramEnd"/>
+      <w:r>
+        <w:rPr>
+          <w:strike/>
+          <w:lang w:val="en-US"/>
+        </w:rPr>
+        <w:t>-</w:t>
+      </w:r>
+      <w:proofErr w:type="gramStart"/>
+      <w:r>
+        <w:rPr>
+          <w:strike/>
+          <w:lang w:val="en-US"/>
+        </w:rPr>
+        <w:t>toggle{</w:t>
+      </w:r>
+      <w:proofErr w:type="gramEnd"/>
+    </w:p>
+    <w:p>
+      <w:pPr>
+        <w:rPr>
+          <w:strike/>
+          <w:lang w:val="en-US"/>
+        </w:rPr>
+      </w:pPr>
+      <w:r>
+        <w:rPr>
+          <w:strike/>
           <w:lang w:val="en-US"/>
         </w:rPr>
         <w:t>    display: inline-flex;</w:t>
@@ -2623,11 +2794,13 @@
     <w:p>
       <w:pPr>
         <w:rPr>
-          <w:lang w:val="en-US"/>
-        </w:rPr>
-      </w:pPr>
-      <w:r>
-        <w:rPr>
+          <w:strike/>
+          <w:lang w:val="en-US"/>
+        </w:rPr>
+      </w:pPr>
+      <w:r>
+        <w:rPr>
+          <w:strike/>
           <w:lang w:val="en-US"/>
         </w:rPr>
         <w:t>    align-items: center;</w:t>
@@ -2636,11 +2809,13 @@
     <w:p>
       <w:pPr>
         <w:rPr>
-          <w:lang w:val="en-US"/>
-        </w:rPr>
-      </w:pPr>
-      <w:r>
-        <w:rPr>
+          <w:strike/>
+          <w:lang w:val="en-US"/>
+        </w:rPr>
+      </w:pPr>
+      <w:r>
+        <w:rPr>
+          <w:strike/>
           <w:lang w:val="en-US"/>
         </w:rPr>
         <w:t>    justify-content: center;</w:t>
@@ -2649,11 +2824,13 @@
     <w:p>
       <w:pPr>
         <w:rPr>
-          <w:lang w:val="en-US"/>
-        </w:rPr>
-      </w:pPr>
-      <w:r>
-        <w:rPr>
+          <w:strike/>
+          <w:lang w:val="en-US"/>
+        </w:rPr>
+      </w:pPr>
+      <w:r>
+        <w:rPr>
+          <w:strike/>
           <w:lang w:val="en-US"/>
         </w:rPr>
         <w:t>  }</w:t>
@@ -2662,18 +2839,21 @@
     <w:p>
       <w:pPr>
         <w:rPr>
-          <w:lang w:val="en-US"/>
-        </w:rPr>
-      </w:pPr>
-    </w:p>
-    <w:p>
-      <w:pPr>
-        <w:rPr>
-          <w:lang w:val="en-US"/>
-        </w:rPr>
-      </w:pPr>
-      <w:r>
-        <w:rPr>
+          <w:strike/>
+          <w:lang w:val="en-US"/>
+        </w:rPr>
+      </w:pPr>
+    </w:p>
+    <w:p>
+      <w:pPr>
+        <w:rPr>
+          <w:strike/>
+          <w:lang w:val="en-US"/>
+        </w:rPr>
+      </w:pPr>
+      <w:r>
+        <w:rPr>
+          <w:strike/>
           <w:lang w:val="en-US"/>
         </w:rPr>
         <w:t>  /* Keeps header-right aligned */</w:t>
@@ -2682,24 +2862,53 @@
     <w:p>
       <w:pPr>
         <w:rPr>
-          <w:lang w:val="en-US"/>
-        </w:rPr>
-      </w:pPr>
-      <w:r>
-        <w:rPr>
-          <w:lang w:val="en-US"/>
-        </w:rPr>
-        <w:t>  .header-right{</w:t>
-      </w:r>
-    </w:p>
-    <w:p>
-      <w:pPr>
-        <w:rPr>
-          <w:lang w:val="en-US"/>
-        </w:rPr>
-      </w:pPr>
-      <w:r>
-        <w:rPr>
+          <w:strike/>
+          <w:lang w:val="en-US"/>
+        </w:rPr>
+      </w:pPr>
+      <w:r>
+        <w:rPr>
+          <w:strike/>
+          <w:lang w:val="en-US"/>
+        </w:rPr>
+        <w:t xml:space="preserve">  </w:t>
+      </w:r>
+      <w:proofErr w:type="gramStart"/>
+      <w:r>
+        <w:rPr>
+          <w:strike/>
+          <w:lang w:val="en-US"/>
+        </w:rPr>
+        <w:t>.header</w:t>
+      </w:r>
+      <w:proofErr w:type="gramEnd"/>
+      <w:r>
+        <w:rPr>
+          <w:strike/>
+          <w:lang w:val="en-US"/>
+        </w:rPr>
+        <w:t>-</w:t>
+      </w:r>
+      <w:proofErr w:type="gramStart"/>
+      <w:r>
+        <w:rPr>
+          <w:strike/>
+          <w:lang w:val="en-US"/>
+        </w:rPr>
+        <w:t>right{</w:t>
+      </w:r>
+      <w:proofErr w:type="gramEnd"/>
+    </w:p>
+    <w:p>
+      <w:pPr>
+        <w:rPr>
+          <w:strike/>
+          <w:lang w:val="en-US"/>
+        </w:rPr>
+      </w:pPr>
+      <w:r>
+        <w:rPr>
+          <w:strike/>
           <w:lang w:val="en-US"/>
         </w:rPr>
         <w:t xml:space="preserve">    gap: 0.75rem; </w:t>
@@ -2708,11 +2917,13 @@
     <w:p>
       <w:pPr>
         <w:rPr>
-          <w:lang w:val="en-US"/>
-        </w:rPr>
-      </w:pPr>
-      <w:r>
-        <w:rPr>
+          <w:strike/>
+          <w:lang w:val="en-US"/>
+        </w:rPr>
+      </w:pPr>
+      <w:r>
+        <w:rPr>
+          <w:strike/>
           <w:lang w:val="en-US"/>
         </w:rPr>
         <w:t>  }</w:t>
@@ -2721,18 +2932,21 @@
     <w:p>
       <w:pPr>
         <w:rPr>
-          <w:lang w:val="en-US"/>
-        </w:rPr>
-      </w:pPr>
-    </w:p>
-    <w:p>
-      <w:pPr>
-        <w:rPr>
-          <w:lang w:val="en-US"/>
-        </w:rPr>
-      </w:pPr>
-      <w:r>
-        <w:rPr>
+          <w:strike/>
+          <w:lang w:val="en-US"/>
+        </w:rPr>
+      </w:pPr>
+    </w:p>
+    <w:p>
+      <w:pPr>
+        <w:rPr>
+          <w:strike/>
+          <w:lang w:val="en-US"/>
+        </w:rPr>
+      </w:pPr>
+      <w:r>
+        <w:rPr>
+          <w:strike/>
           <w:lang w:val="en-US"/>
         </w:rPr>
         <w:t>  /* Hide nav in mobile */</w:t>
@@ -2741,24 +2955,53 @@
     <w:p>
       <w:pPr>
         <w:rPr>
-          <w:lang w:val="en-US"/>
-        </w:rPr>
-      </w:pPr>
-      <w:r>
-        <w:rPr>
-          <w:lang w:val="en-US"/>
-        </w:rPr>
-        <w:t>  header .header-right nav{</w:t>
-      </w:r>
-    </w:p>
-    <w:p>
-      <w:pPr>
-        <w:rPr>
-          <w:lang w:val="en-US"/>
-        </w:rPr>
-      </w:pPr>
-      <w:r>
-        <w:rPr>
+          <w:strike/>
+          <w:lang w:val="en-US"/>
+        </w:rPr>
+      </w:pPr>
+      <w:r>
+        <w:rPr>
+          <w:strike/>
+          <w:lang w:val="en-US"/>
+        </w:rPr>
+        <w:t xml:space="preserve">  </w:t>
+      </w:r>
+      <w:proofErr w:type="gramStart"/>
+      <w:r>
+        <w:rPr>
+          <w:strike/>
+          <w:lang w:val="en-US"/>
+        </w:rPr>
+        <w:t>header .header</w:t>
+      </w:r>
+      <w:proofErr w:type="gramEnd"/>
+      <w:r>
+        <w:rPr>
+          <w:strike/>
+          <w:lang w:val="en-US"/>
+        </w:rPr>
+        <w:t xml:space="preserve">-right </w:t>
+      </w:r>
+      <w:proofErr w:type="gramStart"/>
+      <w:r>
+        <w:rPr>
+          <w:strike/>
+          <w:lang w:val="en-US"/>
+        </w:rPr>
+        <w:t>nav{</w:t>
+      </w:r>
+      <w:proofErr w:type="gramEnd"/>
+    </w:p>
+    <w:p>
+      <w:pPr>
+        <w:rPr>
+          <w:strike/>
+          <w:lang w:val="en-US"/>
+        </w:rPr>
+      </w:pPr>
+      <w:r>
+        <w:rPr>
+          <w:strike/>
           <w:lang w:val="en-US"/>
         </w:rPr>
         <w:t>    display: none;</w:t>
@@ -2767,11 +3010,13 @@
     <w:p>
       <w:pPr>
         <w:rPr>
-          <w:lang w:val="en-US"/>
-        </w:rPr>
-      </w:pPr>
-      <w:r>
-        <w:rPr>
+          <w:strike/>
+          <w:lang w:val="en-US"/>
+        </w:rPr>
+      </w:pPr>
+      <w:r>
+        <w:rPr>
+          <w:strike/>
           <w:lang w:val="en-US"/>
         </w:rPr>
         <w:t>    position: absolute;</w:t>
@@ -2780,11 +3025,13 @@
     <w:p>
       <w:pPr>
         <w:rPr>
-          <w:lang w:val="en-US"/>
-        </w:rPr>
-      </w:pPr>
-      <w:r>
-        <w:rPr>
+          <w:strike/>
+          <w:lang w:val="en-US"/>
+        </w:rPr>
+      </w:pPr>
+      <w:r>
+        <w:rPr>
+          <w:strike/>
           <w:lang w:val="en-US"/>
         </w:rPr>
         <w:t>    top: 100%;</w:t>
@@ -2793,11 +3040,13 @@
     <w:p>
       <w:pPr>
         <w:rPr>
-          <w:lang w:val="en-US"/>
-        </w:rPr>
-      </w:pPr>
-      <w:r>
-        <w:rPr>
+          <w:strike/>
+          <w:lang w:val="en-US"/>
+        </w:rPr>
+      </w:pPr>
+      <w:r>
+        <w:rPr>
+          <w:strike/>
           <w:lang w:val="en-US"/>
         </w:rPr>
         <w:t>    left: 0;</w:t>
@@ -2806,11 +3055,13 @@
     <w:p>
       <w:pPr>
         <w:rPr>
-          <w:lang w:val="en-US"/>
-        </w:rPr>
-      </w:pPr>
-      <w:r>
-        <w:rPr>
+          <w:strike/>
+          <w:lang w:val="en-US"/>
+        </w:rPr>
+      </w:pPr>
+      <w:r>
+        <w:rPr>
+          <w:strike/>
           <w:lang w:val="en-US"/>
         </w:rPr>
         <w:t>    right: 0;</w:t>
@@ -2819,24 +3070,44 @@
     <w:p>
       <w:pPr>
         <w:rPr>
-          <w:lang w:val="en-US"/>
-        </w:rPr>
-      </w:pPr>
-      <w:r>
-        <w:rPr>
-          <w:lang w:val="en-US"/>
-        </w:rPr>
-        <w:t>    background: var(--bg-color);</w:t>
-      </w:r>
-    </w:p>
-    <w:p>
-      <w:pPr>
-        <w:rPr>
-          <w:lang w:val="en-US"/>
-        </w:rPr>
-      </w:pPr>
-      <w:r>
-        <w:rPr>
+          <w:strike/>
+          <w:lang w:val="en-US"/>
+        </w:rPr>
+      </w:pPr>
+      <w:r>
+        <w:rPr>
+          <w:strike/>
+          <w:lang w:val="en-US"/>
+        </w:rPr>
+        <w:t xml:space="preserve">    background: </w:t>
+      </w:r>
+      <w:proofErr w:type="gramStart"/>
+      <w:r>
+        <w:rPr>
+          <w:strike/>
+          <w:lang w:val="en-US"/>
+        </w:rPr>
+        <w:t>var(</w:t>
+      </w:r>
+      <w:proofErr w:type="gramEnd"/>
+      <w:r>
+        <w:rPr>
+          <w:strike/>
+          <w:lang w:val="en-US"/>
+        </w:rPr>
+        <w:t>--bg-color);</w:t>
+      </w:r>
+    </w:p>
+    <w:p>
+      <w:pPr>
+        <w:rPr>
+          <w:strike/>
+          <w:lang w:val="en-US"/>
+        </w:rPr>
+      </w:pPr>
+      <w:r>
+        <w:rPr>
+          <w:strike/>
           <w:lang w:val="en-US"/>
         </w:rPr>
         <w:t>    padding: 0.75rem 1.25rem;</w:t>
@@ -2845,24 +3116,44 @@
     <w:p>
       <w:pPr>
         <w:rPr>
-          <w:lang w:val="en-US"/>
-        </w:rPr>
-      </w:pPr>
-      <w:r>
-        <w:rPr>
-          <w:lang w:val="en-US"/>
-        </w:rPr>
-        <w:t>    border-top: 1px solid rgba(0,0,0,0.08);</w:t>
-      </w:r>
-    </w:p>
-    <w:p>
-      <w:pPr>
-        <w:rPr>
-          <w:lang w:val="en-US"/>
-        </w:rPr>
-      </w:pPr>
-      <w:r>
-        <w:rPr>
+          <w:strike/>
+          <w:lang w:val="en-US"/>
+        </w:rPr>
+      </w:pPr>
+      <w:r>
+        <w:rPr>
+          <w:strike/>
+          <w:lang w:val="en-US"/>
+        </w:rPr>
+        <w:t xml:space="preserve">    border-top: 1px solid </w:t>
+      </w:r>
+      <w:proofErr w:type="gramStart"/>
+      <w:r>
+        <w:rPr>
+          <w:strike/>
+          <w:lang w:val="en-US"/>
+        </w:rPr>
+        <w:t>rgba(</w:t>
+      </w:r>
+      <w:proofErr w:type="gramEnd"/>
+      <w:r>
+        <w:rPr>
+          <w:strike/>
+          <w:lang w:val="en-US"/>
+        </w:rPr>
+        <w:t>0,0,0,0.08);</w:t>
+      </w:r>
+    </w:p>
+    <w:p>
+      <w:pPr>
+        <w:rPr>
+          <w:strike/>
+          <w:lang w:val="en-US"/>
+        </w:rPr>
+      </w:pPr>
+      <w:r>
+        <w:rPr>
+          <w:strike/>
           <w:lang w:val="en-US"/>
         </w:rPr>
         <w:t>    z-index: 1001;</w:t>
@@ -2871,11 +3162,13 @@
     <w:p>
       <w:pPr>
         <w:rPr>
-          <w:lang w:val="en-US"/>
-        </w:rPr>
-      </w:pPr>
-      <w:r>
-        <w:rPr>
+          <w:strike/>
+          <w:lang w:val="en-US"/>
+        </w:rPr>
+      </w:pPr>
+      <w:r>
+        <w:rPr>
+          <w:strike/>
           <w:lang w:val="en-US"/>
         </w:rPr>
         <w:t>  }</w:t>
@@ -2884,18 +3177,21 @@
     <w:p>
       <w:pPr>
         <w:rPr>
-          <w:lang w:val="en-US"/>
-        </w:rPr>
-      </w:pPr>
-    </w:p>
-    <w:p>
-      <w:pPr>
-        <w:rPr>
-          <w:lang w:val="en-US"/>
-        </w:rPr>
-      </w:pPr>
-      <w:r>
-        <w:rPr>
+          <w:strike/>
+          <w:lang w:val="en-US"/>
+        </w:rPr>
+      </w:pPr>
+    </w:p>
+    <w:p>
+      <w:pPr>
+        <w:rPr>
+          <w:strike/>
+          <w:lang w:val="en-US"/>
+        </w:rPr>
+      </w:pPr>
+      <w:r>
+        <w:rPr>
+          <w:strike/>
           <w:lang w:val="en-US"/>
         </w:rPr>
         <w:t>  /* When it opens */</w:t>
@@ -2904,25 +3200,61 @@
     <w:p>
       <w:pPr>
         <w:rPr>
-          <w:lang w:val="en-US"/>
-        </w:rPr>
-      </w:pPr>
-      <w:r>
-        <w:rPr>
+          <w:strike/>
+          <w:lang w:val="en-US"/>
+        </w:rPr>
+      </w:pPr>
+      <w:r>
+        <w:rPr>
+          <w:strike/>
           <w:lang w:val="en-US"/>
         </w:rPr>
         <w:lastRenderedPageBreak/>
-        <w:t>  header .header-right nav.open{</w:t>
-      </w:r>
-    </w:p>
-    <w:p>
-      <w:pPr>
-        <w:rPr>
-          <w:lang w:val="en-US"/>
-        </w:rPr>
-      </w:pPr>
-      <w:r>
-        <w:rPr>
+        <w:t xml:space="preserve">  </w:t>
+      </w:r>
+      <w:proofErr w:type="gramStart"/>
+      <w:r>
+        <w:rPr>
+          <w:strike/>
+          <w:lang w:val="en-US"/>
+        </w:rPr>
+        <w:t>header .header</w:t>
+      </w:r>
+      <w:proofErr w:type="gramEnd"/>
+      <w:r>
+        <w:rPr>
+          <w:strike/>
+          <w:lang w:val="en-US"/>
+        </w:rPr>
+        <w:t xml:space="preserve">-right </w:t>
+      </w:r>
+      <w:proofErr w:type="gramStart"/>
+      <w:r>
+        <w:rPr>
+          <w:strike/>
+          <w:lang w:val="en-US"/>
+        </w:rPr>
+        <w:t>nav.open</w:t>
+      </w:r>
+      <w:proofErr w:type="gramEnd"/>
+      <w:r>
+        <w:rPr>
+          <w:strike/>
+          <w:lang w:val="en-US"/>
+        </w:rPr>
+        <w:t>{</w:t>
+      </w:r>
+    </w:p>
+    <w:p>
+      <w:pPr>
+        <w:rPr>
+          <w:strike/>
+          <w:lang w:val="en-US"/>
+        </w:rPr>
+      </w:pPr>
+      <w:r>
+        <w:rPr>
+          <w:strike/>
           <w:lang w:val="en-US"/>
         </w:rPr>
         <w:t>    display: block;</w:t>
@@ -2931,11 +3263,13 @@
     <w:p>
       <w:pPr>
         <w:rPr>
-          <w:lang w:val="en-US"/>
-        </w:rPr>
-      </w:pPr>
-      <w:r>
-        <w:rPr>
+          <w:strike/>
+          <w:lang w:val="en-US"/>
+        </w:rPr>
+      </w:pPr>
+      <w:r>
+        <w:rPr>
+          <w:strike/>
           <w:lang w:val="en-US"/>
         </w:rPr>
         <w:t>  }</w:t>
@@ -2944,18 +3278,21 @@
     <w:p>
       <w:pPr>
         <w:rPr>
-          <w:lang w:val="en-US"/>
-        </w:rPr>
-      </w:pPr>
-    </w:p>
-    <w:p>
-      <w:pPr>
-        <w:rPr>
-          <w:lang w:val="en-US"/>
-        </w:rPr>
-      </w:pPr>
-      <w:r>
-        <w:rPr>
+          <w:strike/>
+          <w:lang w:val="en-US"/>
+        </w:rPr>
+      </w:pPr>
+    </w:p>
+    <w:p>
+      <w:pPr>
+        <w:rPr>
+          <w:strike/>
+          <w:lang w:val="en-US"/>
+        </w:rPr>
+      </w:pPr>
+      <w:r>
+        <w:rPr>
+          <w:strike/>
           <w:lang w:val="en-US"/>
         </w:rPr>
         <w:t>  /* Menu in column */</w:t>
@@ -2964,24 +3301,53 @@
     <w:p>
       <w:pPr>
         <w:rPr>
-          <w:lang w:val="en-US"/>
-        </w:rPr>
-      </w:pPr>
-      <w:r>
-        <w:rPr>
-          <w:lang w:val="en-US"/>
-        </w:rPr>
-        <w:t>  header .header-right nav ul{</w:t>
-      </w:r>
-    </w:p>
-    <w:p>
-      <w:pPr>
-        <w:rPr>
-          <w:lang w:val="en-US"/>
-        </w:rPr>
-      </w:pPr>
-      <w:r>
-        <w:rPr>
+          <w:strike/>
+          <w:lang w:val="en-US"/>
+        </w:rPr>
+      </w:pPr>
+      <w:r>
+        <w:rPr>
+          <w:strike/>
+          <w:lang w:val="en-US"/>
+        </w:rPr>
+        <w:t xml:space="preserve">  </w:t>
+      </w:r>
+      <w:proofErr w:type="gramStart"/>
+      <w:r>
+        <w:rPr>
+          <w:strike/>
+          <w:lang w:val="en-US"/>
+        </w:rPr>
+        <w:t>header .header</w:t>
+      </w:r>
+      <w:proofErr w:type="gramEnd"/>
+      <w:r>
+        <w:rPr>
+          <w:strike/>
+          <w:lang w:val="en-US"/>
+        </w:rPr>
+        <w:t xml:space="preserve">-right nav </w:t>
+      </w:r>
+      <w:proofErr w:type="gramStart"/>
+      <w:r>
+        <w:rPr>
+          <w:strike/>
+          <w:lang w:val="en-US"/>
+        </w:rPr>
+        <w:t>ul{</w:t>
+      </w:r>
+      <w:proofErr w:type="gramEnd"/>
+    </w:p>
+    <w:p>
+      <w:pPr>
+        <w:rPr>
+          <w:strike/>
+          <w:lang w:val="en-US"/>
+        </w:rPr>
+      </w:pPr>
+      <w:r>
+        <w:rPr>
+          <w:strike/>
           <w:lang w:val="en-US"/>
         </w:rPr>
         <w:t>    flex-direction: column;</w:t>
@@ -2990,11 +3356,13 @@
     <w:p>
       <w:pPr>
         <w:rPr>
-          <w:lang w:val="en-US"/>
-        </w:rPr>
-      </w:pPr>
-      <w:r>
-        <w:rPr>
+          <w:strike/>
+          <w:lang w:val="en-US"/>
+        </w:rPr>
+      </w:pPr>
+      <w:r>
+        <w:rPr>
+          <w:strike/>
           <w:lang w:val="en-US"/>
         </w:rPr>
         <w:t>    gap: 0.5rem;</w:t>
@@ -3003,11 +3371,13 @@
     <w:p>
       <w:pPr>
         <w:rPr>
-          <w:lang w:val="en-US"/>
-        </w:rPr>
-      </w:pPr>
-      <w:r>
-        <w:rPr>
+          <w:strike/>
+          <w:lang w:val="en-US"/>
+        </w:rPr>
+      </w:pPr>
+      <w:r>
+        <w:rPr>
+          <w:strike/>
           <w:lang w:val="en-US"/>
         </w:rPr>
         <w:t>  }</w:t>

</xml_diff>